<commit_message>
chore(cv): regenerate CV assets after content fixes
</commit_message>
<xml_diff>
--- a/public/uwe-schwarz-cv-de-2026-10-17.docx
+++ b/public/uwe-schwarz-cv-de-2026-10-17.docx
@@ -1136,7 +1136,7 @@
                 <w:sz w:val="18"/>
                 <w:szCs w:val="18"/>
               </w:rPr>
-              <w:t xml:space="preserve">Durchführung von Sicherheits-Audits sowie sicherheitstechnische Begleitung von Applikations- und Netzwerk-Migrationen.</w:t>
+              <w:t xml:space="preserve">Durchführung von Sicherheitsaudits sowie sicherheitstechnische Begleitung von Applikations- und Netzwerk-Migrationen.</w:t>
             </w:r>
           </w:p>
           <w:p>
@@ -1174,7 +1174,7 @@
                 <w:sz w:val="18"/>
                 <w:szCs w:val="18"/>
               </w:rPr>
-              <w:t xml:space="preserve">Beratung zu Datenschutz-, Audit- und Zertifizierungsanforderungen, unter anderem mit Bezug auf ISO 27001, BSI Grundschutz, NIST und MITRE.</w:t>
+              <w:t xml:space="preserve">Beratung zu Datenschutz-, Audit- und Zertifizierungsanforderungen, unter anderem mit Bezug auf ISO 27001, BSI IT-Grundschutz, NIST und MITRE.</w:t>
             </w:r>
           </w:p>
           <w:p>
@@ -1564,7 +1564,7 @@
                 <w:sz w:val="18"/>
                 <w:szCs w:val="18"/>
               </w:rPr>
-              <w:t xml:space="preserve">Zusätzliche Verantwortung in der umliegenden Mail-Infrastruktur, darunter dovecot, postfix, Linux-basierte Dienste, DNS, Proxy, Lastverteilung und Cloud-Speicher.</w:t>
+              <w:t xml:space="preserve">Zusätzliche Verantwortung in der umliegenden Mail-Infrastruktur, darunter Dovecot, Postfix, Linux-basierte Dienste, DNS, Proxy, Lastverteilung und Cloud-Speicher.</w:t>
             </w:r>
           </w:p>
           <w:p>
@@ -1654,17 +1654,17 @@
                 <w:sz w:val="20"/>
                 <w:szCs w:val="20"/>
               </w:rPr>
-              <w:t xml:space="preserve">Vorstandsmitglied</w:t>
-            </w:r>
-          </w:p>
-          <w:p>
-            <w:r>
-              <w:rPr>
-                <w:color w:val="1B6E5A"/>
-                <w:sz w:val="18"/>
-                <w:szCs w:val="18"/>
-              </w:rPr>
-              <w:t xml:space="preserve">DEGIT AG</w:t>
+              <w:t xml:space="preserve">Lead Software Engineer – SchlauFabrik Trainingsplattform</w:t>
+            </w:r>
+          </w:p>
+          <w:p>
+            <w:r>
+              <w:rPr>
+                <w:color w:val="1B6E5A"/>
+                <w:sz w:val="18"/>
+                <w:szCs w:val="18"/>
+              </w:rPr>
+              <w:t xml:space="preserve">xtensible UG (haftungsbeschränkt) &amp; Co. KG</w:t>
             </w:r>
             <w:r>
               <w:rPr>
@@ -1672,7 +1672,7 @@
                 <w:sz w:val="18"/>
                 <w:szCs w:val="18"/>
               </w:rPr>
-              <w:t xml:space="preserve"> — Mai 2018 - Heute</w:t>
+              <w:t xml:space="preserve"> — Dez 2025 - Heute</w:t>
             </w:r>
           </w:p>
           <w:p>
@@ -1704,64 +1704,140 @@
                 <w:sz w:val="18"/>
                 <w:szCs w:val="18"/>
               </w:rPr>
-              <w:t xml:space="preserve">Verantwortung auf Vorstandsebene für Informationssicherheit, Datenschutz und Compliance-Themen.</w:t>
-            </w:r>
-          </w:p>
-          <w:p>
-            <w:pPr>
-              <w:pStyle w:val="ListParagraph"/>
-              <w:numPr>
-                <w:ilvl w:val="0"/>
-                <w:numId w:val="1"/>
-              </w:numPr>
-            </w:pPr>
-            <w:r>
-              <w:rPr>
-                <w:b w:val="false"/>
-                <w:bCs w:val="false"/>
-                <w:color w:val="07090B"/>
-                <w:sz w:val="18"/>
-                <w:szCs w:val="18"/>
-              </w:rPr>
-              <w:t xml:space="preserve">Vertrauenswürdiger Ansprechpartner für Security-, Infrastruktur- und regulatorische Anforderungen in Kundenprojekten.</w:t>
-            </w:r>
-          </w:p>
-          <w:p>
-            <w:pPr>
-              <w:pStyle w:val="ListParagraph"/>
-              <w:numPr>
-                <w:ilvl w:val="0"/>
-                <w:numId w:val="1"/>
-              </w:numPr>
-            </w:pPr>
-            <w:r>
-              <w:rPr>
-                <w:b w:val="false"/>
-                <w:bCs w:val="false"/>
-                <w:color w:val="07090B"/>
-                <w:sz w:val="18"/>
-                <w:szCs w:val="18"/>
-              </w:rPr>
-              <w:t xml:space="preserve">Beitrag zu sicheren und rechtskonformen IT-Architekturen mit Fokus auf moderne Technologien wie IPv6, Zero Trust und Zero-Config-VPN-Ansätze.</w:t>
-            </w:r>
-          </w:p>
-          <w:p>
-            <w:pPr>
-              <w:pStyle w:val="ListParagraph"/>
-              <w:numPr>
-                <w:ilvl w:val="0"/>
-                <w:numId w:val="1"/>
-              </w:numPr>
-            </w:pPr>
-            <w:r>
-              <w:rPr>
-                <w:b w:val="false"/>
-                <w:bCs w:val="false"/>
-                <w:color w:val="07090B"/>
-                <w:sz w:val="18"/>
-                <w:szCs w:val="18"/>
-              </w:rPr>
-              <w:t xml:space="preserve">Verbindung von Governance-Anforderungen mit praktischer technischer Umsetzung in Security- und Infrastrukturinitiativen.</w:t>
+              <w:t xml:space="preserve">Konzeption, Architektur und Entwicklung einer mandantenfähigen Trainingsplattform für Compliance- und KI-Themen mit rollenbasierter Zugriffskontrolle und klarer Mandantenisolation.</w:t>
+            </w:r>
+          </w:p>
+          <w:p>
+            <w:pPr>
+              <w:pStyle w:val="ListParagraph"/>
+              <w:numPr>
+                <w:ilvl w:val="0"/>
+                <w:numId w:val="1"/>
+              </w:numPr>
+            </w:pPr>
+            <w:r>
+              <w:rPr>
+                <w:b w:val="false"/>
+                <w:bCs w:val="false"/>
+                <w:color w:val="07090B"/>
+                <w:sz w:val="18"/>
+                <w:szCs w:val="18"/>
+              </w:rPr>
+              <w:t xml:space="preserve">Umsetzung zentraler Plattformfunktionen wie Kursauslieferung, Fortschrittsverfolgung, Quizze, Zuweisungen sowie Admin-Dashboards für Mandanten- und Benutzerverwaltung.</w:t>
+            </w:r>
+          </w:p>
+          <w:p>
+            <w:pPr>
+              <w:pStyle w:val="ListParagraph"/>
+              <w:numPr>
+                <w:ilvl w:val="0"/>
+                <w:numId w:val="1"/>
+              </w:numPr>
+            </w:pPr>
+            <w:r>
+              <w:rPr>
+                <w:b w:val="false"/>
+                <w:bCs w:val="false"/>
+                <w:color w:val="07090B"/>
+                <w:sz w:val="18"/>
+                <w:szCs w:val="18"/>
+              </w:rPr>
+              <w:t xml:space="preserve">Implementierung von Security-by-Design mit Postgres Row-Level Security, Audit-Logs, Rate Limiting sowie gehärteten Authentifizierungsflüssen auf Basis von Passkeys, Magic Links, 2FA und SSO.</w:t>
+            </w:r>
+          </w:p>
+          <w:p>
+            <w:pPr>
+              <w:pStyle w:val="ListParagraph"/>
+              <w:numPr>
+                <w:ilvl w:val="0"/>
+                <w:numId w:val="1"/>
+              </w:numPr>
+            </w:pPr>
+            <w:r>
+              <w:rPr>
+                <w:b w:val="false"/>
+                <w:bCs w:val="false"/>
+                <w:color w:val="07090B"/>
+                <w:sz w:val="18"/>
+                <w:szCs w:val="18"/>
+              </w:rPr>
+              <w:t xml:space="preserve">Entwicklung manipulationserschwerter PDF-Zertifikate mit QR-Verifikation, kryptografischem Hashing und Bulk-Export-Funktionen für Audit- und Nachweisprozesse.</w:t>
+            </w:r>
+          </w:p>
+          <w:p>
+            <w:pPr>
+              <w:pStyle w:val="ListParagraph"/>
+              <w:numPr>
+                <w:ilvl w:val="0"/>
+                <w:numId w:val="1"/>
+              </w:numPr>
+            </w:pPr>
+            <w:r>
+              <w:rPr>
+                <w:b w:val="false"/>
+                <w:bCs w:val="false"/>
+                <w:color w:val="07090B"/>
+                <w:sz w:val="18"/>
+                <w:szCs w:val="18"/>
+              </w:rPr>
+              <w:t xml:space="preserve">Integration von Stripe-Abrechnung inklusive Subscriptions, Customer Portal und Webhooks sowie Umsetzung mandantenbasierter Lizenzmodelle und Soft-Lock-Mechanismen für Nutzungsgrenzen.</w:t>
+            </w:r>
+          </w:p>
+          <w:p>
+            <w:pPr>
+              <w:pStyle w:val="ListParagraph"/>
+              <w:numPr>
+                <w:ilvl w:val="0"/>
+                <w:numId w:val="1"/>
+              </w:numPr>
+            </w:pPr>
+            <w:r>
+              <w:rPr>
+                <w:b w:val="false"/>
+                <w:bCs w:val="false"/>
+                <w:color w:val="07090B"/>
+                <w:sz w:val="18"/>
+                <w:szCs w:val="18"/>
+              </w:rPr>
+              <w:t xml:space="preserve">Technische Umsetzung mit Next.js App Router, TypeScript, Bun, Tailwind, next-intl, Neon Postgres, Resend sowie automatisierten Tests mit Vitest und Playwright.</w:t>
+            </w:r>
+          </w:p>
+          <w:p>
+            <w:pPr>
+              <w:pStyle w:val="ListParagraph"/>
+              <w:numPr>
+                <w:ilvl w:val="0"/>
+                <w:numId w:val="1"/>
+              </w:numPr>
+            </w:pPr>
+            <w:r>
+              <w:rPr>
+                <w:b/>
+                <w:bCs/>
+                <w:color w:val="1B6E5A"/>
+                <w:sz w:val="18"/>
+                <w:szCs w:val="18"/>
+              </w:rPr>
+              <w:t xml:space="preserve">Erfolg: Mandantenfähige SaaS-Plattform aufgebaut, die produktiv im Kundeneinsatz ist – mit Row-Level Security, Audit-Logs und Stripe-Abrechnung.</w:t>
+            </w:r>
+          </w:p>
+          <w:p>
+            <w:pPr>
+              <w:pStyle w:val="ListParagraph"/>
+              <w:numPr>
+                <w:ilvl w:val="0"/>
+                <w:numId w:val="1"/>
+              </w:numPr>
+            </w:pPr>
+            <w:r>
+              <w:rPr>
+                <w:b/>
+                <w:bCs/>
+                <w:color w:val="1B6E5A"/>
+                <w:sz w:val="18"/>
+                <w:szCs w:val="18"/>
+              </w:rPr>
+              <w:t xml:space="preserve">Erfolg: Produktlogik, Compliance-Anforderungen und technische Umsetzung in einer konsistenten Plattformarchitektur verbunden.</w:t>
             </w:r>
           </w:p>
           <w:p/>
@@ -1773,17 +1849,17 @@
                 <w:sz w:val="20"/>
                 <w:szCs w:val="20"/>
               </w:rPr>
-              <w:t xml:space="preserve">Lead Software Engineer – SchlauFabrik Trainingsplattform</w:t>
-            </w:r>
-          </w:p>
-          <w:p>
-            <w:r>
-              <w:rPr>
-                <w:color w:val="1B6E5A"/>
-                <w:sz w:val="18"/>
-                <w:szCs w:val="18"/>
-              </w:rPr>
-              <w:t xml:space="preserve">xtensible UG (haftungsbeschränkt) &amp; Co. KG</w:t>
+              <w:t xml:space="preserve">Gründungsmitglied &amp; Datenschutzbeauftragter</w:t>
+            </w:r>
+          </w:p>
+          <w:p>
+            <w:r>
+              <w:rPr>
+                <w:color w:val="1B6E5A"/>
+                <w:sz w:val="18"/>
+                <w:szCs w:val="18"/>
+              </w:rPr>
+              <w:t xml:space="preserve">AKTion gegen Krebs gUG</w:t>
             </w:r>
             <w:r>
               <w:rPr>
@@ -1791,7 +1867,7 @@
                 <w:sz w:val="18"/>
                 <w:szCs w:val="18"/>
               </w:rPr>
-              <w:t xml:space="preserve"> — Dezember 2025 - Heute</w:t>
+              <w:t xml:space="preserve"> — Mai 2025 - Heute</w:t>
             </w:r>
           </w:p>
           <w:p>
@@ -1804,159 +1880,102 @@
                 <w:sz w:val="18"/>
                 <w:szCs w:val="18"/>
               </w:rPr>
-              <w:t xml:space="preserve">Hockenheim, Deutschland</w:t>
-            </w:r>
-          </w:p>
-          <w:p>
-            <w:pPr>
-              <w:pStyle w:val="ListParagraph"/>
-              <w:numPr>
-                <w:ilvl w:val="0"/>
-                <w:numId w:val="1"/>
-              </w:numPr>
-            </w:pPr>
-            <w:r>
-              <w:rPr>
-                <w:b w:val="false"/>
-                <w:bCs w:val="false"/>
-                <w:color w:val="07090B"/>
-                <w:sz w:val="18"/>
-                <w:szCs w:val="18"/>
-              </w:rPr>
-              <w:t xml:space="preserve">Konzeption, Architektur und Entwicklung einer mandantenfähigen Trainingsplattform für Compliance- und KI-Themen mit rollenbasierter Zugriffskontrolle und klarer Mandantenisolation.</w:t>
-            </w:r>
-          </w:p>
-          <w:p>
-            <w:pPr>
-              <w:pStyle w:val="ListParagraph"/>
-              <w:numPr>
-                <w:ilvl w:val="0"/>
-                <w:numId w:val="1"/>
-              </w:numPr>
-            </w:pPr>
-            <w:r>
-              <w:rPr>
-                <w:b w:val="false"/>
-                <w:bCs w:val="false"/>
-                <w:color w:val="07090B"/>
-                <w:sz w:val="18"/>
-                <w:szCs w:val="18"/>
-              </w:rPr>
-              <w:t xml:space="preserve">Umsetzung zentraler Plattformfunktionen wie Kursauslieferung, Fortschrittsverfolgung, Quizze, Zuweisungen sowie Admin-Dashboards für Mandanten- und Benutzerverwaltung.</w:t>
-            </w:r>
-          </w:p>
-          <w:p>
-            <w:pPr>
-              <w:pStyle w:val="ListParagraph"/>
-              <w:numPr>
-                <w:ilvl w:val="0"/>
-                <w:numId w:val="1"/>
-              </w:numPr>
-            </w:pPr>
-            <w:r>
-              <w:rPr>
-                <w:b w:val="false"/>
-                <w:bCs w:val="false"/>
-                <w:color w:val="07090B"/>
-                <w:sz w:val="18"/>
-                <w:szCs w:val="18"/>
-              </w:rPr>
-              <w:t xml:space="preserve">Implementierung von Security-by-Design mit Postgres Row-Level Security, Audit-Logs, Rate Limiting sowie gehärteten Authentifizierungsflüssen auf Basis von Passkeys, Magic Links, 2FA und SSO.</w:t>
-            </w:r>
-          </w:p>
-          <w:p>
-            <w:pPr>
-              <w:pStyle w:val="ListParagraph"/>
-              <w:numPr>
-                <w:ilvl w:val="0"/>
-                <w:numId w:val="1"/>
-              </w:numPr>
-            </w:pPr>
-            <w:r>
-              <w:rPr>
-                <w:b w:val="false"/>
-                <w:bCs w:val="false"/>
-                <w:color w:val="07090B"/>
-                <w:sz w:val="18"/>
-                <w:szCs w:val="18"/>
-              </w:rPr>
-              <w:t xml:space="preserve">Entwicklung manipulationserschwerter PDF-Zertifikate mit QR-Verifikation, kryptografischem Hashing und Bulk-Export-Funktionen für Audit- und Nachweisprozesse.</w:t>
-            </w:r>
-          </w:p>
-          <w:p>
-            <w:pPr>
-              <w:pStyle w:val="ListParagraph"/>
-              <w:numPr>
-                <w:ilvl w:val="0"/>
-                <w:numId w:val="1"/>
-              </w:numPr>
-            </w:pPr>
-            <w:r>
-              <w:rPr>
-                <w:b w:val="false"/>
-                <w:bCs w:val="false"/>
-                <w:color w:val="07090B"/>
-                <w:sz w:val="18"/>
-                <w:szCs w:val="18"/>
-              </w:rPr>
-              <w:t xml:space="preserve">Integration von Stripe-Abrechnung inklusive Subscriptions, Customer Portal und Webhooks sowie Umsetzung mandantenbasierter Lizenzmodelle und Soft-Lock-Mechanismen für Nutzungsgrenzen.</w:t>
-            </w:r>
-          </w:p>
-          <w:p>
-            <w:pPr>
-              <w:pStyle w:val="ListParagraph"/>
-              <w:numPr>
-                <w:ilvl w:val="0"/>
-                <w:numId w:val="1"/>
-              </w:numPr>
-            </w:pPr>
-            <w:r>
-              <w:rPr>
-                <w:b w:val="false"/>
-                <w:bCs w:val="false"/>
-                <w:color w:val="07090B"/>
-                <w:sz w:val="18"/>
-                <w:szCs w:val="18"/>
-              </w:rPr>
-              <w:t xml:space="preserve">Technische Umsetzung mit Next.js App Router, TypeScript, Bun, Tailwind, next-intl, Neon Postgres, Resend sowie automatisierten Tests mit Vitest und Playwright.</w:t>
-            </w:r>
-          </w:p>
-          <w:p>
-            <w:pPr>
-              <w:pStyle w:val="ListParagraph"/>
-              <w:numPr>
-                <w:ilvl w:val="0"/>
-                <w:numId w:val="1"/>
-              </w:numPr>
-            </w:pPr>
-            <w:r>
-              <w:rPr>
-                <w:b/>
-                <w:bCs/>
-                <w:color w:val="1B6E5A"/>
-                <w:sz w:val="18"/>
-                <w:szCs w:val="18"/>
-              </w:rPr>
-              <w:t xml:space="preserve">Erfolg: Mandantenfähige SaaS-Plattform aufgebaut, die produktiv im Kundeneinsatz ist – mit Row-Level Security, Audit-Logs und Stripe-Abrechnung.</w:t>
-            </w:r>
-          </w:p>
-          <w:p>
-            <w:pPr>
-              <w:pStyle w:val="ListParagraph"/>
-              <w:numPr>
-                <w:ilvl w:val="0"/>
-                <w:numId w:val="1"/>
-              </w:numPr>
-            </w:pPr>
-            <w:r>
-              <w:rPr>
-                <w:b/>
-                <w:bCs/>
-                <w:color w:val="1B6E5A"/>
-                <w:sz w:val="18"/>
-                <w:szCs w:val="18"/>
-              </w:rPr>
-              <w:t xml:space="preserve">Erfolg: Produktlogik, Compliance-Anforderungen und technische Umsetzung in einer konsistenten Plattformarchitektur verbunden.</w:t>
+              <w:t xml:space="preserve">Seevetal, Deutschland</w:t>
+            </w:r>
+          </w:p>
+          <w:p>
+            <w:pPr>
+              <w:pStyle w:val="ListParagraph"/>
+              <w:numPr>
+                <w:ilvl w:val="0"/>
+                <w:numId w:val="1"/>
+              </w:numPr>
+            </w:pPr>
+            <w:r>
+              <w:rPr>
+                <w:b w:val="false"/>
+                <w:bCs w:val="false"/>
+                <w:color w:val="07090B"/>
+                <w:sz w:val="18"/>
+                <w:szCs w:val="18"/>
+              </w:rPr>
+              <w:t xml:space="preserve">Gründungsmitglied mit Verantwortung für Datenschutz und DSGVO-Compliance.</w:t>
+            </w:r>
+          </w:p>
+          <w:p>
+            <w:pPr>
+              <w:pStyle w:val="ListParagraph"/>
+              <w:numPr>
+                <w:ilvl w:val="0"/>
+                <w:numId w:val="1"/>
+              </w:numPr>
+            </w:pPr>
+            <w:r>
+              <w:rPr>
+                <w:b w:val="false"/>
+                <w:bCs w:val="false"/>
+                <w:color w:val="07090B"/>
+                <w:sz w:val="18"/>
+                <w:szCs w:val="18"/>
+              </w:rPr>
+              <w:t xml:space="preserve">Entwicklung und Betreuung der Backend-Systeme.</w:t>
+            </w:r>
+          </w:p>
+          <w:p>
+            <w:pPr>
+              <w:pStyle w:val="ListParagraph"/>
+              <w:numPr>
+                <w:ilvl w:val="0"/>
+                <w:numId w:val="1"/>
+              </w:numPr>
+            </w:pPr>
+            <w:r>
+              <w:rPr>
+                <w:b w:val="false"/>
+                <w:bCs w:val="false"/>
+                <w:color w:val="07090B"/>
+                <w:sz w:val="18"/>
+                <w:szCs w:val="18"/>
+              </w:rPr>
+              <w:t xml:space="preserve">Konzeption und Implementierung KI-gestützter Workflows für die Fallbearbeitung.</w:t>
+            </w:r>
+          </w:p>
+          <w:p>
+            <w:pPr>
+              <w:pStyle w:val="ListParagraph"/>
+              <w:numPr>
+                <w:ilvl w:val="0"/>
+                <w:numId w:val="1"/>
+              </w:numPr>
+            </w:pPr>
+            <w:r>
+              <w:rPr>
+                <w:b w:val="false"/>
+                <w:bCs w:val="false"/>
+                <w:color w:val="07090B"/>
+                <w:sz w:val="18"/>
+                <w:szCs w:val="18"/>
+              </w:rPr>
+              <w:t xml:space="preserve">Verantwortlich für IT-Sicherheitsstrategie und Risikomanagement.</w:t>
+            </w:r>
+          </w:p>
+          <w:p>
+            <w:pPr>
+              <w:pStyle w:val="ListParagraph"/>
+              <w:numPr>
+                <w:ilvl w:val="0"/>
+                <w:numId w:val="1"/>
+              </w:numPr>
+            </w:pPr>
+            <w:r>
+              <w:rPr>
+                <w:b/>
+                <w:bCs/>
+                <w:color w:val="1B6E5A"/>
+                <w:sz w:val="18"/>
+                <w:szCs w:val="18"/>
+              </w:rPr>
+              <w:t xml:space="preserve">Erfolg: DSGVO-konformen Datenschutzrahmen von Grund auf aufgebaut.</w:t>
             </w:r>
           </w:p>
           <w:p/>
@@ -1968,17 +1987,17 @@
                 <w:sz w:val="20"/>
                 <w:szCs w:val="20"/>
               </w:rPr>
-              <w:t xml:space="preserve">Gründungsmitglied &amp; Datenschutzbeauftragter</w:t>
-            </w:r>
-          </w:p>
-          <w:p>
-            <w:r>
-              <w:rPr>
-                <w:color w:val="1B6E5A"/>
-                <w:sz w:val="18"/>
-                <w:szCs w:val="18"/>
-              </w:rPr>
-              <w:t xml:space="preserve">AKTion gegen Krebs gUG</w:t>
+              <w:t xml:space="preserve">Vorstandsmitglied</w:t>
+            </w:r>
+          </w:p>
+          <w:p>
+            <w:r>
+              <w:rPr>
+                <w:color w:val="1B6E5A"/>
+                <w:sz w:val="18"/>
+                <w:szCs w:val="18"/>
+              </w:rPr>
+              <w:t xml:space="preserve">DEGIT AG</w:t>
             </w:r>
             <w:r>
               <w:rPr>
@@ -1986,7 +2005,7 @@
                 <w:sz w:val="18"/>
                 <w:szCs w:val="18"/>
               </w:rPr>
-              <w:t xml:space="preserve"> — Mai 2025 - Heute</w:t>
+              <w:t xml:space="preserve"> — Mai 2018 - Heute</w:t>
             </w:r>
           </w:p>
           <w:p>
@@ -1999,102 +2018,83 @@
                 <w:sz w:val="18"/>
                 <w:szCs w:val="18"/>
               </w:rPr>
-              <w:t xml:space="preserve">Seevetal, Deutschland</w:t>
-            </w:r>
-          </w:p>
-          <w:p>
-            <w:pPr>
-              <w:pStyle w:val="ListParagraph"/>
-              <w:numPr>
-                <w:ilvl w:val="0"/>
-                <w:numId w:val="1"/>
-              </w:numPr>
-            </w:pPr>
-            <w:r>
-              <w:rPr>
-                <w:b w:val="false"/>
-                <w:bCs w:val="false"/>
-                <w:color w:val="07090B"/>
-                <w:sz w:val="18"/>
-                <w:szCs w:val="18"/>
-              </w:rPr>
-              <w:t xml:space="preserve">Gründungsmitglied mit Verantwortung für Datenschutz und DSGVO-Compliance.</w:t>
-            </w:r>
-          </w:p>
-          <w:p>
-            <w:pPr>
-              <w:pStyle w:val="ListParagraph"/>
-              <w:numPr>
-                <w:ilvl w:val="0"/>
-                <w:numId w:val="1"/>
-              </w:numPr>
-            </w:pPr>
-            <w:r>
-              <w:rPr>
-                <w:b w:val="false"/>
-                <w:bCs w:val="false"/>
-                <w:color w:val="07090B"/>
-                <w:sz w:val="18"/>
-                <w:szCs w:val="18"/>
-              </w:rPr>
-              <w:t xml:space="preserve">Entwicklung und Betreuung der Backend-Systeme.</w:t>
-            </w:r>
-          </w:p>
-          <w:p>
-            <w:pPr>
-              <w:pStyle w:val="ListParagraph"/>
-              <w:numPr>
-                <w:ilvl w:val="0"/>
-                <w:numId w:val="1"/>
-              </w:numPr>
-            </w:pPr>
-            <w:r>
-              <w:rPr>
-                <w:b w:val="false"/>
-                <w:bCs w:val="false"/>
-                <w:color w:val="07090B"/>
-                <w:sz w:val="18"/>
-                <w:szCs w:val="18"/>
-              </w:rPr>
-              <w:t xml:space="preserve">Konzeption und Implementierung KI-gestützter Workflows für die Fallbearbeitung.</w:t>
-            </w:r>
-          </w:p>
-          <w:p>
-            <w:pPr>
-              <w:pStyle w:val="ListParagraph"/>
-              <w:numPr>
-                <w:ilvl w:val="0"/>
-                <w:numId w:val="1"/>
-              </w:numPr>
-            </w:pPr>
-            <w:r>
-              <w:rPr>
-                <w:b w:val="false"/>
-                <w:bCs w:val="false"/>
-                <w:color w:val="07090B"/>
-                <w:sz w:val="18"/>
-                <w:szCs w:val="18"/>
-              </w:rPr>
-              <w:t xml:space="preserve">Verantwortlich für IT-Sicherheitsstrategie und Risikomanagement.</w:t>
-            </w:r>
-          </w:p>
-          <w:p>
-            <w:pPr>
-              <w:pStyle w:val="ListParagraph"/>
-              <w:numPr>
-                <w:ilvl w:val="0"/>
-                <w:numId w:val="1"/>
-              </w:numPr>
-            </w:pPr>
-            <w:r>
-              <w:rPr>
-                <w:b/>
-                <w:bCs/>
-                <w:color w:val="1B6E5A"/>
-                <w:sz w:val="18"/>
-                <w:szCs w:val="18"/>
-              </w:rPr>
-              <w:t xml:space="preserve">Erfolg: DSGVO-konformen Datenschutzrahmen von Grund auf aufgebaut.</w:t>
+              <w:t xml:space="preserve">Hockenheim, Deutschland</w:t>
+            </w:r>
+          </w:p>
+          <w:p>
+            <w:pPr>
+              <w:pStyle w:val="ListParagraph"/>
+              <w:numPr>
+                <w:ilvl w:val="0"/>
+                <w:numId w:val="1"/>
+              </w:numPr>
+            </w:pPr>
+            <w:r>
+              <w:rPr>
+                <w:b w:val="false"/>
+                <w:bCs w:val="false"/>
+                <w:color w:val="07090B"/>
+                <w:sz w:val="18"/>
+                <w:szCs w:val="18"/>
+              </w:rPr>
+              <w:t xml:space="preserve">Verantwortung auf Vorstandsebene für Informationssicherheit, Datenschutz und Compliance-Themen.</w:t>
+            </w:r>
+          </w:p>
+          <w:p>
+            <w:pPr>
+              <w:pStyle w:val="ListParagraph"/>
+              <w:numPr>
+                <w:ilvl w:val="0"/>
+                <w:numId w:val="1"/>
+              </w:numPr>
+            </w:pPr>
+            <w:r>
+              <w:rPr>
+                <w:b w:val="false"/>
+                <w:bCs w:val="false"/>
+                <w:color w:val="07090B"/>
+                <w:sz w:val="18"/>
+                <w:szCs w:val="18"/>
+              </w:rPr>
+              <w:t xml:space="preserve">Vertrauenswürdiger Ansprechpartner für Security-, Infrastruktur- und regulatorische Anforderungen in Kundenprojekten.</w:t>
+            </w:r>
+          </w:p>
+          <w:p>
+            <w:pPr>
+              <w:pStyle w:val="ListParagraph"/>
+              <w:numPr>
+                <w:ilvl w:val="0"/>
+                <w:numId w:val="1"/>
+              </w:numPr>
+            </w:pPr>
+            <w:r>
+              <w:rPr>
+                <w:b w:val="false"/>
+                <w:bCs w:val="false"/>
+                <w:color w:val="07090B"/>
+                <w:sz w:val="18"/>
+                <w:szCs w:val="18"/>
+              </w:rPr>
+              <w:t xml:space="preserve">Beitrag zu sicheren und rechtskonformen IT-Architekturen mit Fokus auf moderne Technologien wie IPv6, Zero Trust und Zero-Config-VPN-Ansätze.</w:t>
+            </w:r>
+          </w:p>
+          <w:p>
+            <w:pPr>
+              <w:pStyle w:val="ListParagraph"/>
+              <w:numPr>
+                <w:ilvl w:val="0"/>
+                <w:numId w:val="1"/>
+              </w:numPr>
+            </w:pPr>
+            <w:r>
+              <w:rPr>
+                <w:b w:val="false"/>
+                <w:bCs w:val="false"/>
+                <w:color w:val="07090B"/>
+                <w:sz w:val="18"/>
+                <w:szCs w:val="18"/>
+              </w:rPr>
+              <w:t xml:space="preserve">Verbindung von Governance-Anforderungen mit praktischer technischer Umsetzung in Security- und Infrastrukturinitiativen.</w:t>
             </w:r>
           </w:p>
           <w:p/>
@@ -2124,7 +2124,7 @@
                 <w:sz w:val="18"/>
                 <w:szCs w:val="18"/>
               </w:rPr>
-              <w:t xml:space="preserve"> — Aug 2025 – Okt 2025</w:t>
+              <w:t xml:space="preserve"> — Aug 2025 - Okt 2025</w:t>
             </w:r>
           </w:p>
           <w:p>
@@ -2365,23 +2365,23 @@
                 <w:sz w:val="18"/>
                 <w:szCs w:val="18"/>
               </w:rPr>
-              <w:t xml:space="preserve">ISO27001</w:t>
-            </w:r>
-            <w:r>
-              <w:rPr>
-                <w:color w:val="1B6E5A"/>
-                <w:sz w:val="18"/>
-                <w:szCs w:val="18"/>
-              </w:rPr>
-              <w:t xml:space="preserve">, </w:t>
-            </w:r>
-            <w:r>
-              <w:rPr>
-                <w:color w:val="1B6E5A"/>
-                <w:sz w:val="18"/>
-                <w:szCs w:val="18"/>
-              </w:rPr>
-              <w:t xml:space="preserve">SOC2</w:t>
+              <w:t xml:space="preserve">ISO 27001</w:t>
+            </w:r>
+            <w:r>
+              <w:rPr>
+                <w:color w:val="1B6E5A"/>
+                <w:sz w:val="18"/>
+                <w:szCs w:val="18"/>
+              </w:rPr>
+              <w:t xml:space="preserve">, </w:t>
+            </w:r>
+            <w:r>
+              <w:rPr>
+                <w:color w:val="1B6E5A"/>
+                <w:sz w:val="18"/>
+                <w:szCs w:val="18"/>
+              </w:rPr>
+              <w:t xml:space="preserve">SOC 2</w:t>
             </w:r>
             <w:r>
               <w:rPr>
@@ -2461,7 +2461,7 @@
                 <w:sz w:val="18"/>
                 <w:szCs w:val="18"/>
               </w:rPr>
-              <w:t xml:space="preserve">Vulnerabilitätsmanagement</w:t>
+              <w:t xml:space="preserve">Schwachstellenmanagement</w:t>
             </w:r>
             <w:r>
               <w:rPr>
@@ -2679,7 +2679,7 @@
                 <w:sz w:val="18"/>
                 <w:szCs w:val="18"/>
               </w:rPr>
-              <w:t xml:space="preserve">Bash / Shell Skripte</w:t>
+              <w:t xml:space="preserve">Bash-/Shell-Skripte</w:t>
             </w:r>
             <w:r>
               <w:rPr>

</xml_diff>

<commit_message>
chore: regenerate llms.txt, sitemap and CVs
</commit_message>
<xml_diff>
--- a/public/uwe-schwarz-cv-de-2026-10-17.docx
+++ b/public/uwe-schwarz-cv-de-2026-10-17.docx
@@ -349,7 +349,7 @@
                 <w:sz w:val="18"/>
                 <w:szCs w:val="18"/>
               </w:rPr>
-              <w:t xml:space="preserve">Mit über zwei Jahrzehnten praktischer Erfahrung in IT, Infrastruktur und Security entwickle ich sichere, skalierbare und langfristig tragfähige Systeme. Mein Fokus liegt auf der Architektur und Umsetzung technischer Lösungen – von Linux- und Netzwerk-Infrastrukturen über Security- und Compliance-nahe Plattformen bis hin zu moderner Software für mandantenfähige SaaS-Produkte.</w:t>
+              <w:t xml:space="preserve">Du bekommst Systeme, die halten: sicher, skalierbar und im Alltag gut handhabbar. Seit über 20 Jahren übersetze ich Komplexität und regulatorische Anforderungen in Lösungen, die wirklich funktionieren – vom ersten Konzept bis in den laufenden Betrieb. Dabei verbinde ich technische Tiefe mit Pragmatismus und klarer Kommunikation.</w:t>
             </w:r>
           </w:p>
           <w:p>
@@ -361,7 +361,7 @@
                 <w:sz w:val="18"/>
                 <w:szCs w:val="18"/>
               </w:rPr>
-              <w:t xml:space="preserve">Ich arbeite an der Schnittstelle von technischer Tiefe und klarer Umsetzung. Ob Plattformarchitektur, Security-by-Design, Infrastrukturmodernisierung oder die Übersetzung regulatorischer Anforderungen in belastbare technische Systeme: Ich verbinde Architektur, Engineering und Pragmatismus, damit aus Komplexität funktionierende Lösungen werden.</w:t>
+              <w:t xml:space="preserve">Meine Schwerpunkte sind Architektur, Security, Infrastruktur und KI. Mein Weg führt von Linux- und Netzwerk-Infrastrukturen über Security- und Compliance-Plattformen bis zu mandantenfähigen SaaS-Produkten. KI beobachte ich nicht nur, ich setze sie praktisch ein – mit neuen Modellen, Tools und Workflows, die nützlich, sauber gebaut und sicher betreibbar sind.</w:t>
             </w:r>
           </w:p>
           <w:p>
@@ -425,7 +425,7 @@
                 <w:sz w:val="20"/>
                 <w:szCs w:val="20"/>
               </w:rPr>
-              <w:t xml:space="preserve">Technische Programmleitung IPv6-Migration &amp; IP-Adressmanagement mit Infoblox</w:t>
+              <w:t xml:space="preserve">Technische Programmleitung IPv6</w:t>
             </w:r>
           </w:p>
           <w:p>
@@ -582,7 +582,7 @@
                 <w:sz w:val="20"/>
                 <w:szCs w:val="20"/>
               </w:rPr>
-              <w:t xml:space="preserve">Technische Teilprojektleitung RZ-Migration &amp; Backup-Modernisierung</w:t>
+              <w:t xml:space="preserve">Teilprojektleitung RZ-Migration</w:t>
             </w:r>
           </w:p>
           <w:p>
@@ -739,7 +739,7 @@
                 <w:sz w:val="20"/>
                 <w:szCs w:val="20"/>
               </w:rPr>
-              <w:t xml:space="preserve">Information Security Engineer &amp; Compliance</w:t>
+              <w:t xml:space="preserve">Security &amp; Compliance Engineer</w:t>
             </w:r>
           </w:p>
           <w:p>
@@ -953,7 +953,7 @@
                 <w:sz w:val="20"/>
                 <w:szCs w:val="20"/>
               </w:rPr>
-              <w:t xml:space="preserve">Security Engineer &amp; Incident Response</w:t>
+              <w:t xml:space="preserve">Security Engineer &amp; Incident Responder</w:t>
             </w:r>
           </w:p>
           <w:p>
@@ -1438,7 +1438,7 @@
                 <w:sz w:val="20"/>
                 <w:szCs w:val="20"/>
               </w:rPr>
-              <w:t xml:space="preserve">Systemarchitekt E-Mail-Archivierung</w:t>
+              <w:t xml:space="preserve">Systemarchitekt E-Mail-Archiv</w:t>
             </w:r>
           </w:p>
           <w:p>
@@ -1654,7 +1654,7 @@
                 <w:sz w:val="20"/>
                 <w:szCs w:val="20"/>
               </w:rPr>
-              <w:t xml:space="preserve">Lead Software Engineer – SchlauFabrik Trainingsplattform</w:t>
+              <w:t xml:space="preserve">Lead Software Engineer – SchlauFabrik</w:t>
             </w:r>
           </w:p>
           <w:p>
@@ -2106,7 +2106,7 @@
                 <w:sz w:val="20"/>
                 <w:szCs w:val="20"/>
               </w:rPr>
-              <w:t xml:space="preserve">KI-Trainingsplattform &amp; Evaluierung von KI-Werkzeugen</w:t>
+              <w:t xml:space="preserve">KI-Training &amp; Tool-Evaluierung</w:t>
             </w:r>
           </w:p>
           <w:p>

</xml_diff>